<commit_message>
Document Meridian latency objective
</commit_message>
<xml_diff>
--- a/docs/submission/Meridian_Project_Documentation.docx
+++ b/docs/submission/Meridian_Project_Documentation.docx
@@ -452,6 +452,16 @@
           <w:sz w:val="21"/>
         </w:rPr>
         <w:t>Build stakeholder confidence: ensure at least 90% of reviewed briefs are judged clear, useful, and supported by the available evidence.</w:t>
+      </w:r>
+    </w:p>
+    <w:p>
+      <w:pPr>
+        <w:pStyle w:val="ListBullet"/>
+        <w:spacing w:after="60"/>
+        <w:ind w:left="360" w:hanging="245"/>
+      </w:pPr>
+      <w:r>
+        <w:t>Deliver timely, controlled outcomes: aim to produce either an analyst-ready brief or an explainable safe stop within 15 seconds for suitable alerts; investigate sustained performance above 25 seconds.</w:t>
       </w:r>
     </w:p>
     <w:p>
@@ -2663,6 +2673,16 @@
     </w:p>
     <w:p>
       <w:pPr>
+        <w:pStyle w:val="ListBullet"/>
+        <w:spacing w:after="60"/>
+        <w:ind w:left="360" w:hanging="245"/>
+      </w:pPr>
+      <w:r>
+        <w:t>Operational target: For a suitable alert, Meridian aims to reach a controlled outcome in 15 seconds or less. Sustained performance above 25 seconds requires investigation. This is a demo operating target, not a proven production SLA.</w:t>
+      </w:r>
+    </w:p>
+    <w:p>
+      <w:pPr>
         <w:pStyle w:val="Heading1"/>
       </w:pPr>
       <w:r>

</xml_diff>